<commit_message>
Add internal JK-comments disposition table; correct redline rationale (non-compete + entity/tax)
- JK_Comments_Disposition_INTERNAL.docx: A/B/C disposition of JK's 14 comments + 7 cross-checks under HYBRID (staged) strategy; flags minority terms already in SHA v2; internal-only candid notes
- Redline Summary: corrected Issue 4 non-compete rationale (FTC ban vacated in Ryan v. FTC; NRS 613.195 permits reasonable non-competes); added accuracy note on entity choice (Nevada IPO feasible; controller-transaction standards) and inbound cross-border tax (withholding + Sec. 482; CFC/GILTI are outbound)
- Fix: restore dropped d.save for redline doc

https://claude.ai/code/session_01SkX9Nkj6o3KuWJL6HpkMeT
</commit_message>
<xml_diff>
--- a/Shareholders_Agreement_REDLINE_SUMMARY.docx
+++ b/Shareholders_Agreement_REDLINE_SUMMARY.docx
@@ -412,7 +412,7 @@
           </w:tcPr>
           <w:p>
             <w:r>
-              <w:t>U.S. non-competes are increasingly unenforceable (state-by-state / FTC scrutiny, cf. NRS Ch. 613). Relying on NDA / non-solicit / non-circumvention / IP-protection is more durable while still protecting BNBL's tech, customers, partners and investors.</w:t>
+              <w:t>CORRECTED BASIS (per JK cross-check): the FTC's 2024 federal non-compete ban was vacated (Ryan, LLC v. FTC, N.D. Tex. 2024) and is not in force; Nevada permits reasonable non-competes under NRS 613.195. The reason to lean on NDA / non-solicit / non-circumvention / IP-protection is therefore DURABILITY and avoidance of consideration/enforceability disputes over a broad founder non-compete — not federal unenforceability. Open point for counsel: the carve-outs are asymmetric (BNBL/affiliates may keep competing and licensing in the U.S.), which must be reconciled against any exclusivity granted to NewCo under Issue 2 / Refinement 12.</w:t>
             </w:r>
           </w:p>
         </w:tc>
@@ -1660,6 +1660,34 @@
     <w:p>
       <w:r>
         <w:rPr>
+          <w:b/>
+          <w:sz w:val="21"/>
+        </w:rPr>
+        <w:t>Accuracy corrections (per JK cross-check v1)</w:t>
+      </w:r>
+    </w:p>
+    <w:p>
+      <w:r>
+        <w:rPr>
+          <w:i w:val="0"/>
+          <w:color w:val="555555"/>
+        </w:rPr>
+        <w:t>1. Non-compete basis (Issue 4): the FTC 2024 federal non-compete ban was vacated (Ryan, LLC v. FTC) and is not in force; Nevada permits reasonable non-competes (NRS 613.195). The covenant strategy stands on durability grounds, not federal unenforceability — rationale text corrected above.</w:t>
+      </w:r>
+    </w:p>
+    <w:p>
+      <w:r>
+        <w:rPr>
+          <w:i w:val="0"/>
+          <w:color w:val="555555"/>
+        </w:rPr>
+        <w:t>2. Entity &amp; cross-border tax: an IPO as a Nevada C-corp is legally possible (Delaware is investor convention, not a legal requirement; growing 'DExit' trend). For a BNBL-controlled company with related-party deals, weigh Delaware 'entire fairness' review of controller transactions against Nevada's more director/controller-protective standards. CFC / Subpart F / GILTI are OUTBOUND rules and generally do NOT apply to the U.S. sub's own U.S. operations; the primary U.S. issues for this INBOUND (KR-parent / U.S.-sub) structure are royalty/dividend withholding under the U.S.–Korea treaty and transfer pricing (IRC Sec. 482). [Counsel to confirm current treaty rates and any 2026 statutory renaming.]</w:t>
+      </w:r>
+    </w:p>
+    <w:p/>
+    <w:p>
+      <w:r>
+        <w:rPr>
           <w:i/>
           <w:color w:val="555555"/>
         </w:rPr>

</xml_diff>